<commit_message>
feat: apply minimal product document cover
</commit_message>
<xml_diff>
--- a/backend/portal/product_assets/bj_docs/assets/feasibility/template.docx
+++ b/backend/portal/product_assets/bj_docs/assets/feasibility/template.docx
@@ -73,30 +73,6 @@
     </w:p>
     <w:p>
       <w:pPr>
-        <w:ind w:firstLine="0" w:firstLineChars="0"/>
-        <w:jc w:val="center"/>
-        <w:rPr>
-          <w:b/>
-          <w:bCs/>
-          <w:color w:val="auto"/>
-          <w:sz w:val="44"/>
-          <w:szCs w:val="44"/>
-        </w:rPr>
-      </w:pPr>
-      <w:r>
-        <w:rPr>
-          <w:rFonts w:hint="eastAsia"/>
-          <w:b/>
-          <w:bCs/>
-          <w:color w:val="auto"/>
-          <w:sz w:val="44"/>
-          <w:szCs w:val="44"/>
-        </w:rPr>
-        <w:t xml:space="preserve">{{subtitle}}</w:t>
-      </w:r>
-    </w:p>
-    <w:p>
-      <w:pPr>
         <w:ind w:firstLine="480"/>
         <w:rPr>
           <w:color w:val="auto"/>
@@ -164,144 +140,6 @@
         </w:rPr>
       </w:pPr>
       <w:r/>
-    </w:p>
-    <w:p>
-      <w:pPr>
-        <w:pStyle w:val="70"/>
-        <w:ind w:left="1822" w:leftChars="759" w:firstLine="487" w:firstLineChars="202"/>
-        <w:rPr>
-          <w:rFonts w:hint="eastAsia" w:hAnsi="宋体" w:eastAsia="宋体" w:cs="宋体"/>
-          <w:b/>
-          <w:bCs/>
-          <w:color w:val="auto"/>
-          <w:szCs w:val="28"/>
-          <w:lang w:eastAsia="zh-CN"/>
-        </w:rPr>
-      </w:pPr>
-      <w:r>
-        <w:rPr>
-          <w:rFonts w:hint="eastAsia" w:hAnsi="宋体" w:cs="宋体"/>
-          <w:b/>
-          <w:bCs/>
-          <w:color w:val="auto"/>
-          <w:szCs w:val="28"/>
-          <w:lang w:val="en-US" w:eastAsia="zh-CN"/>
-        </w:rPr>
-        <w:t xml:space="preserve">建设</w:t>
-      </w:r>
-      <w:r>
-        <w:rPr>
-          <w:rFonts w:hint="eastAsia" w:hAnsi="宋体" w:cs="宋体"/>
-          <w:b/>
-          <w:bCs/>
-          <w:color w:val="auto"/>
-          <w:szCs w:val="28"/>
-        </w:rPr>
-        <w:t xml:space="preserve">单位：{{</w:t>
-      </w:r>
-      <w:r>
-        <w:rPr>
-          <w:rFonts w:hint="eastAsia" w:hAnsi="宋体" w:cs="宋体"/>
-          <w:b/>
-          <w:bCs/>
-          <w:color w:val="auto"/>
-          <w:szCs w:val="28"/>
-          <w:lang w:eastAsia="zh-CN"/>
-        </w:rPr>
-        <w:t xml:space="preserve">owner}}</w:t>
-      </w:r>
-    </w:p>
-    <w:p>
-      <w:pPr>
-        <w:pStyle w:val="70"/>
-        <w:ind w:left="1822" w:leftChars="759" w:firstLine="482"/>
-        <w:rPr>
-          <w:rFonts w:hint="eastAsia" w:ascii="仿宋_GB2312"/>
-          <w:b/>
-          <w:bCs/>
-          <w:color w:val="auto"/>
-          <w:kern w:val="0"/>
-          <w:szCs w:val="32"/>
-        </w:rPr>
-      </w:pPr>
-      <w:r>
-        <w:rPr>
-          <w:rFonts w:hint="eastAsia" w:ascii="仿宋_GB2312"/>
-          <w:b/>
-          <w:bCs/>
-          <w:color w:val="auto"/>
-          <w:kern w:val="0"/>
-          <w:szCs w:val="32"/>
-        </w:rPr>
-        <w:t xml:space="preserve">编制单位：{{organization}}</w:t>
-      </w:r>
-    </w:p>
-    <w:p>
-      <w:pPr>
-        <w:pStyle w:val="70"/>
-        <w:ind w:left="1822" w:leftChars="759" w:firstLine="482"/>
-        <w:rPr>
-          <w:rFonts w:hint="eastAsia" w:ascii="仿宋_GB2312" w:hAnsi="Times New Roman" w:eastAsia="宋体"/>
-          <w:b/>
-          <w:bCs/>
-          <w:color w:val="auto"/>
-          <w:kern w:val="0"/>
-          <w:szCs w:val="32"/>
-        </w:rPr>
-      </w:pPr>
-      <w:r>
-        <w:rPr>
-          <w:rFonts w:hint="eastAsia" w:ascii="仿宋_GB2312" w:hAnsi="Times New Roman" w:eastAsia="宋体"/>
-          <w:b/>
-          <w:bCs/>
-          <w:color w:val="auto"/>
-          <w:kern w:val="0"/>
-          <w:szCs w:val="32"/>
-        </w:rPr>
-        <w:t xml:space="preserve">{{date}}</w:t>
-      </w:r>
-      <w:r>
-        <w:rPr>
-          <w:rFonts w:hint="eastAsia" w:ascii="仿宋_GB2312" w:hAnsi="Times New Roman" w:eastAsia="宋体"/>
-          <w:b/>
-          <w:bCs/>
-          <w:color w:val="auto"/>
-          <w:kern w:val="0"/>
-          <w:szCs w:val="32"/>
-          <w:lang w:val="en-US" w:eastAsia="zh-CN"/>
-        </w:rPr>
-      </w:r>
-      <w:r>
-        <w:rPr>
-          <w:rFonts w:hint="eastAsia" w:ascii="仿宋_GB2312" w:hAnsi="Times New Roman" w:eastAsia="宋体"/>
-          <w:b/>
-          <w:bCs/>
-          <w:color w:val="auto"/>
-          <w:kern w:val="0"/>
-          <w:szCs w:val="32"/>
-        </w:rPr>
-      </w:r>
-      <w:r>
-        <w:rPr>
-          <w:rFonts w:hint="eastAsia" w:ascii="仿宋_GB2312"/>
-          <w:b/>
-          <w:bCs/>
-          <w:color w:val="auto"/>
-          <w:kern w:val="0"/>
-          <w:szCs w:val="32"/>
-          <w:lang w:val="en-US" w:eastAsia="zh-CN"/>
-        </w:rPr>
-      </w:r>
-      <w:r>
-        <w:rPr>
-          <w:rFonts w:hint="eastAsia" w:ascii="仿宋_GB2312" w:hAnsi="Times New Roman" w:eastAsia="宋体"/>
-          <w:b/>
-          <w:bCs/>
-          <w:color w:val="auto"/>
-          <w:kern w:val="0"/>
-          <w:szCs w:val="32"/>
-        </w:rPr>
-      </w:r>
     </w:p>
     <w:p>
       <w:pPr>

</xml_diff>